<commit_message>
docs(m8): corrida del 14/09 en el entregable y anotacion sin cifra fija
La captura 1 la toma el autor; la instruccion decia 'recuadro sobre
5 passed (30.0s)' y su corrida dara otro numero. Ahora dice 'con el
tiempo que salga' y la §2 anota que la primera corrida del dia tarda
54,7 s por el arranque de Vite y la carga del modelo.

Co-Authored-By: Claude Opus 5 <noreply@anthropic.com>
</commit_message>
<xml_diff>
--- a/docs/M8_E2E/ENTREGABLE_E2E.docx
+++ b/docs/M8_E2E/ENTREGABLE_E2E.docx
@@ -276,7 +276,7 @@
           <w:p>
             <w:r/>
             <w:r>
-              <w:t>11 de septiembre de 2026</w:t>
+              <w:t>14 de septiembre de 2026 (código: 11/09)</w:t>
             </w:r>
           </w:p>
         </w:tc>
@@ -1526,17 +1526,17 @@
         </w:rPr>
         <w:t>Running 5 tests using 1 worker</w:t>
         <w:br/>
-        <w:t xml:space="preserve">  ok 1 [chromium] › tests\auditado\consulta-procedencia.spec.ts:27:1 › una consulta declara por qué camino salió y de qué tabla viene (5.0s)</w:t>
+        <w:t xml:space="preserve">  ok 1 [chromium] › tests\auditado\consulta-procedencia.spec.ts:27:1 › una consulta declara por qué camino salió y de qué tabla viene (4.4s)</w:t>
         <w:br/>
-        <w:t xml:space="preserve">  ok 2 [chromium] › tests\auditado\listado-muestras.spec.ts:20:1 › el analista abre el listado y no recibe un aviso de acceso denegado (5.9s)</w:t>
+        <w:t xml:space="preserve">  ok 2 [chromium] › tests\auditado\listado-muestras.spec.ts:20:1 › el analista abre el listado y no recibe un aviso de acceso denegado (3.9s)</w:t>
         <w:br/>
-        <w:t xml:space="preserve">  ok 3 [chromium] › tests\auditado\modo-degradado.spec.ts:48:1 › con el pipeline de IA caído la muestra queda registrada y el visor lo dice sin fingir un cariotipo (8.5s)</w:t>
+        <w:t xml:space="preserve">  ok 3 [chromium] › tests\auditado\modo-degradado.spec.ts:48:1 › con el pipeline de IA caído la muestra queda registrada y el visor lo dice sin fingir un cariotipo (10.2s)</w:t>
         <w:br/>
-        <w:t xml:space="preserve">  ok 4 [chromium] › tests\auditado\segregacion-analista-ajeno.spec.ts:50:1 › un analista que no es dueño del caso recibe el aviso de segregación, no un error genérico (5.7s)</w:t>
+        <w:t xml:space="preserve">  ok 4 [chromium] › tests\auditado\segregacion-analista-ajeno.spec.ts:50:1 › un analista que no es dueño del caso recibe el aviso de segregación, no un error genérico (5.6s)</w:t>
         <w:br/>
-        <w:t xml:space="preserve">  ok 5 [chromium] › tests\auditado\sesion-sin-token.spec.ts:24:1 › sin token en localStorage la aplicación no muestra datos de pacientes (1.8s)</w:t>
+        <w:t xml:space="preserve">  ok 5 [chromium] › tests\auditado\sesion-sin-token.spec.ts:24:1 › sin token en localStorage la aplicación no muestra datos de pacientes (2.1s)</w:t>
         <w:br/>
-        <w:t xml:space="preserve">  5 passed (30.0s)</w:t>
+        <w:t xml:space="preserve">  5 passed (29.6s)</w:t>
       </w:r>
     </w:p>
     <w:p>
@@ -1544,10 +1544,10 @@
         <w:rPr>
           <w:b/>
         </w:rPr>
-        <w:t>Tiempo total: 30,0 s.</w:t>
+        <w:t>Tiempo total: 29,6 s</w:t>
       </w:r>
       <w:r>
-        <w:t xml:space="preserve"> Tres tests superan 3 s, y el motivo es el mismo: </w:t>
+        <w:t xml:space="preserve"> (corrida del 14/09 con el stack ya caliente; la primera del día tardó 54,7 s porque arrastra el arranque de Vite y la carga del modelo en Ollama — la cifra que vale es la de la captura, no esta). Tres tests superan 3 s, y el motivo es el mismo: </w:t>
       </w:r>
       <w:r>
         <w:rPr>
@@ -1566,7 +1566,7 @@
         <w:t>modo-degradado</w:t>
       </w:r>
       <w:r>
-        <w:t xml:space="preserve"> (8,5 s) registra una muestra por API contra backend-clinic y después abre dos pantallas; </w:t>
+        <w:t xml:space="preserve"> (10,2 s) registra una muestra por API contra backend-clinic y después abre dos pantallas; </w:t>
       </w:r>
       <w:r>
         <w:rPr>
@@ -4693,17 +4693,17 @@
         <w:t>npx playwright test --reporter=list</w:t>
       </w:r>
       <w:r>
-        <w:t xml:space="preserve">. Anotar: recuadro sobre </w:t>
+        <w:t xml:space="preserve">. Anotar: recuadro sobre la línea </w:t>
       </w:r>
       <w:r>
         <w:rPr>
           <w:rFonts w:ascii="Consolas" w:hAnsi="Consolas"/>
           <w:sz w:val="19"/>
         </w:rPr>
-        <w:t>5 passed (30.0s)</w:t>
+        <w:t>5 passed (…s)</w:t>
       </w:r>
       <w:r>
-        <w:t>; flecha sobre el nombre de cada uno de los 5 tests.</w:t>
+        <w:t xml:space="preserve"> con el tiempo que salga; flecha sobre el nombre de cada uno de los 5 tests.</w:t>
       </w:r>
     </w:p>
     <w:p>

</xml_diff>